<commit_message>
Delay consulting panel: 2:45 start, 3:45 closing
</commit_message>
<xml_diff>
--- a/ICA_2026_CaseComp_Schedule.docx
+++ b/ICA_2026_CaseComp_Schedule.docx
@@ -511,7 +511,7 @@
                 <w:b/>
                 <w:bCs/>
               </w:rPr>
-              <w:t xml:space="preserve">2:10–2:25</w:t>
+              <w:t xml:space="preserve">2:10–2:40</w:t>
             </w:r>
           </w:p>
         </w:tc>
@@ -539,7 +539,7 @@
                 <w:b/>
                 <w:bCs/>
               </w:rPr>
-              <w:t xml:space="preserve">2:25–2:30</w:t>
+              <w:t xml:space="preserve">2:40–2:45</w:t>
             </w:r>
           </w:p>
         </w:tc>
@@ -567,7 +567,7 @@
                 <w:b/>
                 <w:bCs/>
               </w:rPr>
-              <w:t xml:space="preserve">2:30–3:25</w:t>
+              <w:t xml:space="preserve">2:45–3:40</w:t>
             </w:r>
           </w:p>
         </w:tc>
@@ -595,7 +595,7 @@
                 <w:b/>
                 <w:bCs/>
               </w:rPr>
-              <w:t xml:space="preserve">3:30–4:00</w:t>
+              <w:t xml:space="preserve">3:45–4:15</w:t>
             </w:r>
           </w:p>
         </w:tc>

</xml_diff>

<commit_message>
Switch to two parallel rooms: 210 (Track A) and 106 (Track B), 5 teams each
</commit_message>
<xml_diff>
--- a/ICA_2026_CaseComp_Schedule.docx
+++ b/ICA_2026_CaseComp_Schedule.docx
@@ -2,7 +2,7 @@
 <file path=word/document.xml><?xml version="1.0" encoding="utf-8"?>
 <w:document xmlns:w="http://schemas.openxmlformats.org/wordprocessingml/2006/main" xmlns:m="http://schemas.openxmlformats.org/officeDocument/2006/math" xmlns:r="http://schemas.openxmlformats.org/officeDocument/2006/relationships" xmlns:o="urn:schemas-microsoft-com:office:office" xmlns:v="urn:schemas-microsoft-com:vml" xmlns:w10="urn:schemas-microsoft-com:office:word" xmlns:a="http://schemas.openxmlformats.org/drawingml/2006/main" xmlns:pic="http://schemas.openxmlformats.org/drawingml/2006/picture" xmlns:wp="http://schemas.openxmlformats.org/drawingml/2006/wordprocessingDrawing">
   <w:body>
-    <w:bookmarkStart w:id="14" w:name="X160e6d8c89291c054fb196ae47d450c297d56aa"/>
+    <w:bookmarkStart w:id="17" w:name="X160e6d8c89291c054fb196ae47d450c297d56aa"/>
     <w:p>
       <w:pPr>
         <w:pStyle w:val="Heading1"/>
@@ -20,7 +20,7 @@
           <w:b/>
           <w:bCs/>
         </w:rPr>
-        <w:t xml:space="preserve">Saturday, April 25, 2026 — Isenberg Classroom 210</w:t>
+        <w:t xml:space="preserve">Saturday, April 25, 2026</w:t>
       </w:r>
     </w:p>
     <w:p>
@@ -40,6 +40,22 @@
       <w:r>
         <w:t xml:space="preserve">15-minute presentation (strict) + 5-minute Q&amp;A = 20 minutes per team</w:t>
       </w:r>
+      <w:r>
+        <w:t xml:space="preserve"> </w:t>
+      </w:r>
+      <w:r>
+        <w:rPr>
+          <w:b/>
+          <w:bCs/>
+        </w:rPr>
+        <w:t xml:space="preserve">Two parallel rooms:</w:t>
+      </w:r>
+      <w:r>
+        <w:t xml:space="preserve"> </w:t>
+      </w:r>
+      <w:r>
+        <w:t xml:space="preserve">Isenberg 210 and Isenberg 106 · Judges split 2/2 across rooms</w:t>
+      </w:r>
     </w:p>
     <w:p>
       <w:r>
@@ -48,13 +64,13 @@
         </w:pict>
       </w:r>
     </w:p>
-    <w:bookmarkStart w:id="9" w:name="schedule"/>
+    <w:bookmarkStart w:id="9" w:name="joint-sessions"/>
     <w:p>
       <w:pPr>
         <w:pStyle w:val="Heading2"/>
       </w:pPr>
       <w:r>
-        <w:t xml:space="preserve">Schedule</w:t>
+        <w:t xml:space="preserve">Joint Sessions</w:t>
       </w:r>
     </w:p>
     <w:tbl>
@@ -174,439 +190,7 @@
               <w:pStyle w:val="Compact"/>
             </w:pPr>
             <w:r>
-              <w:t xml:space="preserve">Move to Isenberg 210</w:t>
-            </w:r>
-          </w:p>
-        </w:tc>
-      </w:tr>
-      <w:tr>
-        <w:tc>
-          <w:tcPr/>
-          <w:p>
-            <w:pPr>
-              <w:pStyle w:val="Compact"/>
-            </w:pPr>
-            <w:r>
-              <w:rPr>
-                <w:b/>
-                <w:bCs/>
-              </w:rPr>
-              <w:t xml:space="preserve">10:50–11:10</w:t>
-            </w:r>
-          </w:p>
-        </w:tc>
-        <w:tc>
-          <w:tcPr/>
-          <w:p>
-            <w:pPr>
-              <w:pStyle w:val="Compact"/>
-            </w:pPr>
-            <w:r>
-              <w:rPr>
-                <w:b/>
-                <w:bCs/>
-              </w:rPr>
-              <w:t xml:space="preserve">Team 1</w:t>
-            </w:r>
-          </w:p>
-        </w:tc>
-      </w:tr>
-      <w:tr>
-        <w:tc>
-          <w:tcPr/>
-          <w:p>
-            <w:pPr>
-              <w:pStyle w:val="Compact"/>
-            </w:pPr>
-            <w:r>
-              <w:rPr>
-                <w:b/>
-                <w:bCs/>
-              </w:rPr>
-              <w:t xml:space="preserve">11:10–11:30</w:t>
-            </w:r>
-          </w:p>
-        </w:tc>
-        <w:tc>
-          <w:tcPr/>
-          <w:p>
-            <w:pPr>
-              <w:pStyle w:val="Compact"/>
-            </w:pPr>
-            <w:r>
-              <w:rPr>
-                <w:b/>
-                <w:bCs/>
-              </w:rPr>
-              <w:t xml:space="preserve">Team 2</w:t>
-            </w:r>
-          </w:p>
-        </w:tc>
-      </w:tr>
-      <w:tr>
-        <w:tc>
-          <w:tcPr/>
-          <w:p>
-            <w:pPr>
-              <w:pStyle w:val="Compact"/>
-            </w:pPr>
-            <w:r>
-              <w:rPr>
-                <w:b/>
-                <w:bCs/>
-              </w:rPr>
-              <w:t xml:space="preserve">11:30–11:50</w:t>
-            </w:r>
-          </w:p>
-        </w:tc>
-        <w:tc>
-          <w:tcPr/>
-          <w:p>
-            <w:pPr>
-              <w:pStyle w:val="Compact"/>
-            </w:pPr>
-            <w:r>
-              <w:rPr>
-                <w:b/>
-                <w:bCs/>
-              </w:rPr>
-              <w:t xml:space="preserve">Team 3</w:t>
-            </w:r>
-          </w:p>
-        </w:tc>
-      </w:tr>
-      <w:tr>
-        <w:tc>
-          <w:tcPr/>
-          <w:p>
-            <w:pPr>
-              <w:pStyle w:val="Compact"/>
-            </w:pPr>
-            <w:r>
-              <w:rPr>
-                <w:b/>
-                <w:bCs/>
-              </w:rPr>
-              <w:t xml:space="preserve">11:50–12:10</w:t>
-            </w:r>
-          </w:p>
-        </w:tc>
-        <w:tc>
-          <w:tcPr/>
-          <w:p>
-            <w:pPr>
-              <w:pStyle w:val="Compact"/>
-            </w:pPr>
-            <w:r>
-              <w:rPr>
-                <w:b/>
-                <w:bCs/>
-              </w:rPr>
-              <w:t xml:space="preserve">Team 4</w:t>
-            </w:r>
-          </w:p>
-        </w:tc>
-      </w:tr>
-      <w:tr>
-        <w:tc>
-          <w:tcPr/>
-          <w:p>
-            <w:pPr>
-              <w:pStyle w:val="Compact"/>
-            </w:pPr>
-            <w:r>
-              <w:rPr>
-                <w:b/>
-                <w:bCs/>
-              </w:rPr>
-              <w:t xml:space="preserve">12:10–12:30</w:t>
-            </w:r>
-          </w:p>
-        </w:tc>
-        <w:tc>
-          <w:tcPr/>
-          <w:p>
-            <w:pPr>
-              <w:pStyle w:val="Compact"/>
-            </w:pPr>
-            <w:r>
-              <w:rPr>
-                <w:b/>
-                <w:bCs/>
-              </w:rPr>
-              <w:t xml:space="preserve">Team 5</w:t>
-            </w:r>
-          </w:p>
-        </w:tc>
-      </w:tr>
-      <w:tr>
-        <w:tc>
-          <w:tcPr/>
-          <w:p>
-            <w:pPr>
-              <w:pStyle w:val="Compact"/>
-            </w:pPr>
-            <w:r>
-              <w:rPr>
-                <w:b/>
-                <w:bCs/>
-              </w:rPr>
-              <w:t xml:space="preserve">12:30–12:50</w:t>
-            </w:r>
-          </w:p>
-        </w:tc>
-        <w:tc>
-          <w:tcPr/>
-          <w:p>
-            <w:pPr>
-              <w:pStyle w:val="Compact"/>
-            </w:pPr>
-            <w:r>
-              <w:rPr>
-                <w:b/>
-                <w:bCs/>
-              </w:rPr>
-              <w:t xml:space="preserve">Team 6</w:t>
-            </w:r>
-          </w:p>
-        </w:tc>
-      </w:tr>
-      <w:tr>
-        <w:tc>
-          <w:tcPr/>
-          <w:p>
-            <w:pPr>
-              <w:pStyle w:val="Compact"/>
-            </w:pPr>
-            <w:r>
-              <w:rPr>
-                <w:b/>
-                <w:bCs/>
-              </w:rPr>
-              <w:t xml:space="preserve">12:50–1:10</w:t>
-            </w:r>
-          </w:p>
-        </w:tc>
-        <w:tc>
-          <w:tcPr/>
-          <w:p>
-            <w:pPr>
-              <w:pStyle w:val="Compact"/>
-            </w:pPr>
-            <w:r>
-              <w:rPr>
-                <w:b/>
-                <w:bCs/>
-              </w:rPr>
-              <w:t xml:space="preserve">Team 7</w:t>
-            </w:r>
-          </w:p>
-        </w:tc>
-      </w:tr>
-      <w:tr>
-        <w:tc>
-          <w:tcPr/>
-          <w:p>
-            <w:pPr>
-              <w:pStyle w:val="Compact"/>
-            </w:pPr>
-            <w:r>
-              <w:rPr>
-                <w:b/>
-                <w:bCs/>
-              </w:rPr>
-              <w:t xml:space="preserve">1:10–1:30</w:t>
-            </w:r>
-          </w:p>
-        </w:tc>
-        <w:tc>
-          <w:tcPr/>
-          <w:p>
-            <w:pPr>
-              <w:pStyle w:val="Compact"/>
-            </w:pPr>
-            <w:r>
-              <w:rPr>
-                <w:b/>
-                <w:bCs/>
-              </w:rPr>
-              <w:t xml:space="preserve">Team 8</w:t>
-            </w:r>
-          </w:p>
-        </w:tc>
-      </w:tr>
-      <w:tr>
-        <w:tc>
-          <w:tcPr/>
-          <w:p>
-            <w:pPr>
-              <w:pStyle w:val="Compact"/>
-            </w:pPr>
-            <w:r>
-              <w:rPr>
-                <w:b/>
-                <w:bCs/>
-              </w:rPr>
-              <w:t xml:space="preserve">1:30–1:50</w:t>
-            </w:r>
-          </w:p>
-        </w:tc>
-        <w:tc>
-          <w:tcPr/>
-          <w:p>
-            <w:pPr>
-              <w:pStyle w:val="Compact"/>
-            </w:pPr>
-            <w:r>
-              <w:rPr>
-                <w:b/>
-                <w:bCs/>
-              </w:rPr>
-              <w:t xml:space="preserve">Team 9</w:t>
-            </w:r>
-          </w:p>
-        </w:tc>
-      </w:tr>
-      <w:tr>
-        <w:tc>
-          <w:tcPr/>
-          <w:p>
-            <w:pPr>
-              <w:pStyle w:val="Compact"/>
-            </w:pPr>
-            <w:r>
-              <w:rPr>
-                <w:b/>
-                <w:bCs/>
-              </w:rPr>
-              <w:t xml:space="preserve">1:50–2:10</w:t>
-            </w:r>
-          </w:p>
-        </w:tc>
-        <w:tc>
-          <w:tcPr/>
-          <w:p>
-            <w:pPr>
-              <w:pStyle w:val="Compact"/>
-            </w:pPr>
-            <w:r>
-              <w:rPr>
-                <w:b/>
-                <w:bCs/>
-              </w:rPr>
-              <w:t xml:space="preserve">Team 10</w:t>
-            </w:r>
-          </w:p>
-        </w:tc>
-      </w:tr>
-      <w:tr>
-        <w:tc>
-          <w:tcPr/>
-          <w:p>
-            <w:pPr>
-              <w:pStyle w:val="Compact"/>
-            </w:pPr>
-            <w:r>
-              <w:rPr>
-                <w:b/>
-                <w:bCs/>
-              </w:rPr>
-              <w:t xml:space="preserve">2:10–2:40</w:t>
-            </w:r>
-          </w:p>
-        </w:tc>
-        <w:tc>
-          <w:tcPr/>
-          <w:p>
-            <w:pPr>
-              <w:pStyle w:val="Compact"/>
-            </w:pPr>
-            <w:r>
-              <w:t xml:space="preserve">Judges deliberate</w:t>
-            </w:r>
-          </w:p>
-        </w:tc>
-      </w:tr>
-      <w:tr>
-        <w:tc>
-          <w:tcPr/>
-          <w:p>
-            <w:pPr>
-              <w:pStyle w:val="Compact"/>
-            </w:pPr>
-            <w:r>
-              <w:rPr>
-                <w:b/>
-                <w:bCs/>
-              </w:rPr>
-              <w:t xml:space="preserve">2:40–2:45</w:t>
-            </w:r>
-          </w:p>
-        </w:tc>
-        <w:tc>
-          <w:tcPr/>
-          <w:p>
-            <w:pPr>
-              <w:pStyle w:val="Compact"/>
-            </w:pPr>
-            <w:r>
-              <w:t xml:space="preserve">Move to Isenberg 108</w:t>
-            </w:r>
-          </w:p>
-        </w:tc>
-      </w:tr>
-      <w:tr>
-        <w:tc>
-          <w:tcPr/>
-          <w:p>
-            <w:pPr>
-              <w:pStyle w:val="Compact"/>
-            </w:pPr>
-            <w:r>
-              <w:rPr>
-                <w:b/>
-                <w:bCs/>
-              </w:rPr>
-              <w:t xml:space="preserve">2:45–3:40</w:t>
-            </w:r>
-          </w:p>
-        </w:tc>
-        <w:tc>
-          <w:tcPr/>
-          <w:p>
-            <w:pPr>
-              <w:pStyle w:val="Compact"/>
-            </w:pPr>
-            <w:r>
-              <w:t xml:space="preserve">Consulting Panel — Isenberg 108</w:t>
-            </w:r>
-          </w:p>
-        </w:tc>
-      </w:tr>
-      <w:tr>
-        <w:tc>
-          <w:tcPr/>
-          <w:p>
-            <w:pPr>
-              <w:pStyle w:val="Compact"/>
-            </w:pPr>
-            <w:r>
-              <w:rPr>
-                <w:b/>
-                <w:bCs/>
-              </w:rPr>
-              <w:t xml:space="preserve">3:45–4:15</w:t>
-            </w:r>
-          </w:p>
-        </w:tc>
-        <w:tc>
-          <w:tcPr/>
-          <w:p>
-            <w:pPr>
-              <w:pStyle w:val="Compact"/>
-            </w:pPr>
-            <w:r>
-              <w:t xml:space="preserve">Closing Ceremony &amp; Awards — Isenberg 108</w:t>
+              <w:t xml:space="preserve">Move to assigned room (210 or 106)</w:t>
             </w:r>
           </w:p>
         </w:tc>
@@ -620,13 +204,688 @@
       </w:r>
     </w:p>
     <w:bookmarkEnd w:id="9"/>
-    <w:bookmarkStart w:id="10" w:name="lunch-logistics"/>
+    <w:bookmarkStart w:id="10" w:name="room-210-track-a"/>
     <w:p>
       <w:pPr>
         <w:pStyle w:val="Heading2"/>
       </w:pPr>
       <w:r>
-        <w:t xml:space="preserve">Lunch &amp; Logistics</w:t>
+        <w:t xml:space="preserve">Room 210 — Track A</w:t>
+      </w:r>
+    </w:p>
+    <w:tbl>
+      <w:tblPr>
+        <w:tblStyle w:val="Table"/>
+        <w:tblW w:type="auto" w:w="0"/>
+        <w:tblLook w:firstRow="1" w:lastRow="0" w:firstColumn="0" w:lastColumn="0" w:noHBand="0" w:noVBand="0" w:val="0020"/>
+      </w:tblPr>
+      <w:tblGrid>
+        <w:gridCol w:w="3960"/>
+        <w:gridCol w:w="3960"/>
+      </w:tblGrid>
+      <w:tr>
+        <w:trPr>
+          <w:tblHeader w:val="on"/>
+        </w:trPr>
+        <w:tc>
+          <w:tcPr/>
+          <w:p>
+            <w:pPr>
+              <w:pStyle w:val="Compact"/>
+            </w:pPr>
+            <w:r>
+              <w:t xml:space="preserve">Time</w:t>
+            </w:r>
+          </w:p>
+        </w:tc>
+        <w:tc>
+          <w:tcPr/>
+          <w:p>
+            <w:pPr>
+              <w:pStyle w:val="Compact"/>
+            </w:pPr>
+            <w:r>
+              <w:t xml:space="preserve">Event</w:t>
+            </w:r>
+          </w:p>
+        </w:tc>
+      </w:tr>
+      <w:tr>
+        <w:tc>
+          <w:tcPr/>
+          <w:p>
+            <w:pPr>
+              <w:pStyle w:val="Compact"/>
+            </w:pPr>
+            <w:r>
+              <w:rPr>
+                <w:b/>
+                <w:bCs/>
+              </w:rPr>
+              <w:t xml:space="preserve">10:50–11:10</w:t>
+            </w:r>
+          </w:p>
+        </w:tc>
+        <w:tc>
+          <w:tcPr/>
+          <w:p>
+            <w:pPr>
+              <w:pStyle w:val="Compact"/>
+            </w:pPr>
+            <w:r>
+              <w:rPr>
+                <w:b/>
+                <w:bCs/>
+              </w:rPr>
+              <w:t xml:space="preserve">Team A1</w:t>
+            </w:r>
+          </w:p>
+        </w:tc>
+      </w:tr>
+      <w:tr>
+        <w:tc>
+          <w:tcPr/>
+          <w:p>
+            <w:pPr>
+              <w:pStyle w:val="Compact"/>
+            </w:pPr>
+            <w:r>
+              <w:rPr>
+                <w:b/>
+                <w:bCs/>
+              </w:rPr>
+              <w:t xml:space="preserve">11:10–11:30</w:t>
+            </w:r>
+          </w:p>
+        </w:tc>
+        <w:tc>
+          <w:tcPr/>
+          <w:p>
+            <w:pPr>
+              <w:pStyle w:val="Compact"/>
+            </w:pPr>
+            <w:r>
+              <w:rPr>
+                <w:b/>
+                <w:bCs/>
+              </w:rPr>
+              <w:t xml:space="preserve">Team A2</w:t>
+            </w:r>
+          </w:p>
+        </w:tc>
+      </w:tr>
+      <w:tr>
+        <w:tc>
+          <w:tcPr/>
+          <w:p>
+            <w:pPr>
+              <w:pStyle w:val="Compact"/>
+            </w:pPr>
+            <w:r>
+              <w:rPr>
+                <w:b/>
+                <w:bCs/>
+              </w:rPr>
+              <w:t xml:space="preserve">11:30–11:50</w:t>
+            </w:r>
+          </w:p>
+        </w:tc>
+        <w:tc>
+          <w:tcPr/>
+          <w:p>
+            <w:pPr>
+              <w:pStyle w:val="Compact"/>
+            </w:pPr>
+            <w:r>
+              <w:rPr>
+                <w:b/>
+                <w:bCs/>
+              </w:rPr>
+              <w:t xml:space="preserve">Team A3</w:t>
+            </w:r>
+          </w:p>
+        </w:tc>
+      </w:tr>
+      <w:tr>
+        <w:tc>
+          <w:tcPr/>
+          <w:p>
+            <w:pPr>
+              <w:pStyle w:val="Compact"/>
+            </w:pPr>
+            <w:r>
+              <w:rPr>
+                <w:b/>
+                <w:bCs/>
+              </w:rPr>
+              <w:t xml:space="preserve">11:50–12:00</w:t>
+            </w:r>
+          </w:p>
+        </w:tc>
+        <w:tc>
+          <w:tcPr/>
+          <w:p>
+            <w:pPr>
+              <w:pStyle w:val="Compact"/>
+            </w:pPr>
+            <w:r>
+              <w:t xml:space="preserve">Break</w:t>
+            </w:r>
+          </w:p>
+        </w:tc>
+      </w:tr>
+      <w:tr>
+        <w:tc>
+          <w:tcPr/>
+          <w:p>
+            <w:pPr>
+              <w:pStyle w:val="Compact"/>
+            </w:pPr>
+            <w:r>
+              <w:rPr>
+                <w:b/>
+                <w:bCs/>
+              </w:rPr>
+              <w:t xml:space="preserve">12:00–12:20</w:t>
+            </w:r>
+          </w:p>
+        </w:tc>
+        <w:tc>
+          <w:tcPr/>
+          <w:p>
+            <w:pPr>
+              <w:pStyle w:val="Compact"/>
+            </w:pPr>
+            <w:r>
+              <w:rPr>
+                <w:b/>
+                <w:bCs/>
+              </w:rPr>
+              <w:t xml:space="preserve">Team A4</w:t>
+            </w:r>
+          </w:p>
+        </w:tc>
+      </w:tr>
+      <w:tr>
+        <w:tc>
+          <w:tcPr/>
+          <w:p>
+            <w:pPr>
+              <w:pStyle w:val="Compact"/>
+            </w:pPr>
+            <w:r>
+              <w:rPr>
+                <w:b/>
+                <w:bCs/>
+              </w:rPr>
+              <w:t xml:space="preserve">12:20–12:40</w:t>
+            </w:r>
+          </w:p>
+        </w:tc>
+        <w:tc>
+          <w:tcPr/>
+          <w:p>
+            <w:pPr>
+              <w:pStyle w:val="Compact"/>
+            </w:pPr>
+            <w:r>
+              <w:rPr>
+                <w:b/>
+                <w:bCs/>
+              </w:rPr>
+              <w:t xml:space="preserve">Team A5</w:t>
+            </w:r>
+          </w:p>
+        </w:tc>
+      </w:tr>
+    </w:tbl>
+    <w:bookmarkEnd w:id="10"/>
+    <w:bookmarkStart w:id="11" w:name="room-106-track-b"/>
+    <w:p>
+      <w:pPr>
+        <w:pStyle w:val="Heading2"/>
+      </w:pPr>
+      <w:r>
+        <w:t xml:space="preserve">Room 106 — Track B</w:t>
+      </w:r>
+    </w:p>
+    <w:tbl>
+      <w:tblPr>
+        <w:tblStyle w:val="Table"/>
+        <w:tblW w:type="auto" w:w="0"/>
+        <w:tblLook w:firstRow="1" w:lastRow="0" w:firstColumn="0" w:lastColumn="0" w:noHBand="0" w:noVBand="0" w:val="0020"/>
+      </w:tblPr>
+      <w:tblGrid>
+        <w:gridCol w:w="3960"/>
+        <w:gridCol w:w="3960"/>
+      </w:tblGrid>
+      <w:tr>
+        <w:trPr>
+          <w:tblHeader w:val="on"/>
+        </w:trPr>
+        <w:tc>
+          <w:tcPr/>
+          <w:p>
+            <w:pPr>
+              <w:pStyle w:val="Compact"/>
+            </w:pPr>
+            <w:r>
+              <w:t xml:space="preserve">Time</w:t>
+            </w:r>
+          </w:p>
+        </w:tc>
+        <w:tc>
+          <w:tcPr/>
+          <w:p>
+            <w:pPr>
+              <w:pStyle w:val="Compact"/>
+            </w:pPr>
+            <w:r>
+              <w:t xml:space="preserve">Event</w:t>
+            </w:r>
+          </w:p>
+        </w:tc>
+      </w:tr>
+      <w:tr>
+        <w:tc>
+          <w:tcPr/>
+          <w:p>
+            <w:pPr>
+              <w:pStyle w:val="Compact"/>
+            </w:pPr>
+            <w:r>
+              <w:rPr>
+                <w:b/>
+                <w:bCs/>
+              </w:rPr>
+              <w:t xml:space="preserve">10:50–11:10</w:t>
+            </w:r>
+          </w:p>
+        </w:tc>
+        <w:tc>
+          <w:tcPr/>
+          <w:p>
+            <w:pPr>
+              <w:pStyle w:val="Compact"/>
+            </w:pPr>
+            <w:r>
+              <w:rPr>
+                <w:b/>
+                <w:bCs/>
+              </w:rPr>
+              <w:t xml:space="preserve">Team B1</w:t>
+            </w:r>
+          </w:p>
+        </w:tc>
+      </w:tr>
+      <w:tr>
+        <w:tc>
+          <w:tcPr/>
+          <w:p>
+            <w:pPr>
+              <w:pStyle w:val="Compact"/>
+            </w:pPr>
+            <w:r>
+              <w:rPr>
+                <w:b/>
+                <w:bCs/>
+              </w:rPr>
+              <w:t xml:space="preserve">11:10–11:30</w:t>
+            </w:r>
+          </w:p>
+        </w:tc>
+        <w:tc>
+          <w:tcPr/>
+          <w:p>
+            <w:pPr>
+              <w:pStyle w:val="Compact"/>
+            </w:pPr>
+            <w:r>
+              <w:rPr>
+                <w:b/>
+                <w:bCs/>
+              </w:rPr>
+              <w:t xml:space="preserve">Team B2</w:t>
+            </w:r>
+          </w:p>
+        </w:tc>
+      </w:tr>
+      <w:tr>
+        <w:tc>
+          <w:tcPr/>
+          <w:p>
+            <w:pPr>
+              <w:pStyle w:val="Compact"/>
+            </w:pPr>
+            <w:r>
+              <w:rPr>
+                <w:b/>
+                <w:bCs/>
+              </w:rPr>
+              <w:t xml:space="preserve">11:30–11:50</w:t>
+            </w:r>
+          </w:p>
+        </w:tc>
+        <w:tc>
+          <w:tcPr/>
+          <w:p>
+            <w:pPr>
+              <w:pStyle w:val="Compact"/>
+            </w:pPr>
+            <w:r>
+              <w:rPr>
+                <w:b/>
+                <w:bCs/>
+              </w:rPr>
+              <w:t xml:space="preserve">Team B3</w:t>
+            </w:r>
+          </w:p>
+        </w:tc>
+      </w:tr>
+      <w:tr>
+        <w:tc>
+          <w:tcPr/>
+          <w:p>
+            <w:pPr>
+              <w:pStyle w:val="Compact"/>
+            </w:pPr>
+            <w:r>
+              <w:rPr>
+                <w:b/>
+                <w:bCs/>
+              </w:rPr>
+              <w:t xml:space="preserve">11:50–12:00</w:t>
+            </w:r>
+          </w:p>
+        </w:tc>
+        <w:tc>
+          <w:tcPr/>
+          <w:p>
+            <w:pPr>
+              <w:pStyle w:val="Compact"/>
+            </w:pPr>
+            <w:r>
+              <w:t xml:space="preserve">Break</w:t>
+            </w:r>
+          </w:p>
+        </w:tc>
+      </w:tr>
+      <w:tr>
+        <w:tc>
+          <w:tcPr/>
+          <w:p>
+            <w:pPr>
+              <w:pStyle w:val="Compact"/>
+            </w:pPr>
+            <w:r>
+              <w:rPr>
+                <w:b/>
+                <w:bCs/>
+              </w:rPr>
+              <w:t xml:space="preserve">12:00–12:20</w:t>
+            </w:r>
+          </w:p>
+        </w:tc>
+        <w:tc>
+          <w:tcPr/>
+          <w:p>
+            <w:pPr>
+              <w:pStyle w:val="Compact"/>
+            </w:pPr>
+            <w:r>
+              <w:rPr>
+                <w:b/>
+                <w:bCs/>
+              </w:rPr>
+              <w:t xml:space="preserve">Team B4</w:t>
+            </w:r>
+          </w:p>
+        </w:tc>
+      </w:tr>
+      <w:tr>
+        <w:tc>
+          <w:tcPr/>
+          <w:p>
+            <w:pPr>
+              <w:pStyle w:val="Compact"/>
+            </w:pPr>
+            <w:r>
+              <w:rPr>
+                <w:b/>
+                <w:bCs/>
+              </w:rPr>
+              <w:t xml:space="preserve">12:20–12:40</w:t>
+            </w:r>
+          </w:p>
+        </w:tc>
+        <w:tc>
+          <w:tcPr/>
+          <w:p>
+            <w:pPr>
+              <w:pStyle w:val="Compact"/>
+            </w:pPr>
+            <w:r>
+              <w:rPr>
+                <w:b/>
+                <w:bCs/>
+              </w:rPr>
+              <w:t xml:space="preserve">Team B5</w:t>
+            </w:r>
+          </w:p>
+        </w:tc>
+      </w:tr>
+    </w:tbl>
+    <w:p>
+      <w:r>
+        <w:pict>
+          <v:rect style="width:0;height:1.5pt" o:hralign="center" o:hrstd="t" o:hr="t"/>
+        </w:pict>
+      </w:r>
+    </w:p>
+    <w:bookmarkEnd w:id="11"/>
+    <w:bookmarkStart w:id="12" w:name="joint-afternoon"/>
+    <w:p>
+      <w:pPr>
+        <w:pStyle w:val="Heading2"/>
+      </w:pPr>
+      <w:r>
+        <w:t xml:space="preserve">Joint Afternoon</w:t>
+      </w:r>
+    </w:p>
+    <w:tbl>
+      <w:tblPr>
+        <w:tblStyle w:val="Table"/>
+        <w:tblW w:type="pct" w:w="5000"/>
+        <w:tblLayout w:type="fixed"/>
+        <w:tblLook w:firstRow="1" w:lastRow="0" w:firstColumn="0" w:lastColumn="0" w:noHBand="0" w:noVBand="0" w:val="0020"/>
+      </w:tblPr>
+      <w:tblGrid>
+        <w:gridCol w:w="3655"/>
+        <w:gridCol w:w="4264"/>
+      </w:tblGrid>
+      <w:tr>
+        <w:trPr>
+          <w:tblHeader w:val="on"/>
+        </w:trPr>
+        <w:tc>
+          <w:tcPr/>
+          <w:p>
+            <w:pPr>
+              <w:pStyle w:val="Compact"/>
+            </w:pPr>
+            <w:r>
+              <w:t xml:space="preserve">Time</w:t>
+            </w:r>
+          </w:p>
+        </w:tc>
+        <w:tc>
+          <w:tcPr/>
+          <w:p>
+            <w:pPr>
+              <w:pStyle w:val="Compact"/>
+            </w:pPr>
+            <w:r>
+              <w:t xml:space="preserve">Event</w:t>
+            </w:r>
+          </w:p>
+        </w:tc>
+      </w:tr>
+      <w:tr>
+        <w:tc>
+          <w:tcPr/>
+          <w:p>
+            <w:pPr>
+              <w:pStyle w:val="Compact"/>
+            </w:pPr>
+            <w:r>
+              <w:rPr>
+                <w:b/>
+                <w:bCs/>
+              </w:rPr>
+              <w:t xml:space="preserve">12:40–1:30</w:t>
+            </w:r>
+          </w:p>
+        </w:tc>
+        <w:tc>
+          <w:tcPr/>
+          <w:p>
+            <w:pPr>
+              <w:pStyle w:val="Compact"/>
+            </w:pPr>
+            <w:r>
+              <w:t xml:space="preserve">Judges’ lunch &amp; combined deliberation — Isenberg Atrium / foyer</w:t>
+            </w:r>
+          </w:p>
+        </w:tc>
+      </w:tr>
+      <w:tr>
+        <w:tc>
+          <w:tcPr/>
+          <w:p>
+            <w:pPr>
+              <w:pStyle w:val="Compact"/>
+            </w:pPr>
+            <w:r>
+              <w:rPr>
+                <w:b/>
+                <w:bCs/>
+              </w:rPr>
+              <w:t xml:space="preserve">1:30–2:25</w:t>
+            </w:r>
+          </w:p>
+        </w:tc>
+        <w:tc>
+          <w:tcPr/>
+          <w:p>
+            <w:pPr>
+              <w:pStyle w:val="Compact"/>
+            </w:pPr>
+            <w:r>
+              <w:t xml:space="preserve">Open lunch (buffet in foyer; teams and audience eat)</w:t>
+            </w:r>
+          </w:p>
+        </w:tc>
+      </w:tr>
+      <w:tr>
+        <w:tc>
+          <w:tcPr/>
+          <w:p>
+            <w:pPr>
+              <w:pStyle w:val="Compact"/>
+            </w:pPr>
+            <w:r>
+              <w:rPr>
+                <w:b/>
+                <w:bCs/>
+              </w:rPr>
+              <w:t xml:space="preserve">2:25–2:30</w:t>
+            </w:r>
+          </w:p>
+        </w:tc>
+        <w:tc>
+          <w:tcPr/>
+          <w:p>
+            <w:pPr>
+              <w:pStyle w:val="Compact"/>
+            </w:pPr>
+            <w:r>
+              <w:t xml:space="preserve">Move to Isenberg 108</w:t>
+            </w:r>
+          </w:p>
+        </w:tc>
+      </w:tr>
+      <w:tr>
+        <w:tc>
+          <w:tcPr/>
+          <w:p>
+            <w:pPr>
+              <w:pStyle w:val="Compact"/>
+            </w:pPr>
+            <w:r>
+              <w:rPr>
+                <w:b/>
+                <w:bCs/>
+              </w:rPr>
+              <w:t xml:space="preserve">2:30–3:25</w:t>
+            </w:r>
+          </w:p>
+        </w:tc>
+        <w:tc>
+          <w:tcPr/>
+          <w:p>
+            <w:pPr>
+              <w:pStyle w:val="Compact"/>
+            </w:pPr>
+            <w:r>
+              <w:t xml:space="preserve">Consulting Panel — Isenberg 108</w:t>
+            </w:r>
+          </w:p>
+        </w:tc>
+      </w:tr>
+      <w:tr>
+        <w:tc>
+          <w:tcPr/>
+          <w:p>
+            <w:pPr>
+              <w:pStyle w:val="Compact"/>
+            </w:pPr>
+            <w:r>
+              <w:rPr>
+                <w:b/>
+                <w:bCs/>
+              </w:rPr>
+              <w:t xml:space="preserve">3:30–4:00</w:t>
+            </w:r>
+          </w:p>
+        </w:tc>
+        <w:tc>
+          <w:tcPr/>
+          <w:p>
+            <w:pPr>
+              <w:pStyle w:val="Compact"/>
+            </w:pPr>
+            <w:r>
+              <w:t xml:space="preserve">Closing Ceremony &amp; Awards — Isenberg 108</w:t>
+            </w:r>
+          </w:p>
+        </w:tc>
+      </w:tr>
+    </w:tbl>
+    <w:p>
+      <w:r>
+        <w:pict>
+          <v:rect style="width:0;height:1.5pt" o:hralign="center" o:hrstd="t" o:hr="t"/>
+        </w:pict>
+      </w:r>
+    </w:p>
+    <w:bookmarkEnd w:id="12"/>
+    <w:bookmarkStart w:id="13" w:name="format-details"/>
+    <w:p>
+      <w:pPr>
+        <w:pStyle w:val="Heading2"/>
+      </w:pPr>
+      <w:r>
+        <w:t xml:space="preserve">Format Details</w:t>
       </w:r>
     </w:p>
     <w:p>
@@ -642,23 +901,13 @@
           <w:b/>
           <w:bCs/>
         </w:rPr>
-        <w:t xml:space="preserve">Buffet-style lunch</w:t>
+        <w:t xml:space="preserve">Presentation:</w:t>
       </w:r>
       <w:r>
         <w:t xml:space="preserve"> </w:t>
       </w:r>
       <w:r>
-        <w:t xml:space="preserve">is set out in the foyer starting at</w:t>
-      </w:r>
-      <w:r>
-        <w:t xml:space="preserve"> </w:t>
-      </w:r>
-      <w:r>
-        <w:rPr>
-          <w:b/>
-          <w:bCs/>
-        </w:rPr>
-        <w:t xml:space="preserve">1:30 PM</w:t>
+        <w:t xml:space="preserve">15 minutes, strict</w:t>
       </w:r>
     </w:p>
     <w:p>
@@ -670,23 +919,17 @@
         </w:numPr>
       </w:pPr>
       <w:r>
-        <w:t xml:space="preserve">Teams, audience, and judges eat</w:t>
-      </w:r>
-      <w:r>
-        <w:t xml:space="preserve"> </w:t>
-      </w:r>
-      <w:r>
         <w:rPr>
           <w:b/>
           <w:bCs/>
         </w:rPr>
-        <w:t xml:space="preserve">whenever convenient</w:t>
+        <w:t xml:space="preserve">Q&amp;A:</w:t>
       </w:r>
       <w:r>
         <w:t xml:space="preserve"> </w:t>
       </w:r>
       <w:r>
-        <w:t xml:space="preserve">— no formal break</w:t>
+        <w:t xml:space="preserve">5 minutes</w:t>
       </w:r>
     </w:p>
     <w:p>
@@ -698,7 +941,17 @@
         </w:numPr>
       </w:pPr>
       <w:r>
-        <w:t xml:space="preserve">Judges grab food between presentations</w:t>
+        <w:rPr>
+          <w:b/>
+          <w:bCs/>
+        </w:rPr>
+        <w:t xml:space="preserve">Transition:</w:t>
+      </w:r>
+      <w:r>
+        <w:t xml:space="preserve"> </w:t>
+      </w:r>
+      <w:r>
+        <w:t xml:space="preserve">Built into the 20-minute slot</w:t>
       </w:r>
     </w:p>
     <w:p>
@@ -710,17 +963,49 @@
         </w:numPr>
       </w:pPr>
       <w:r>
-        <w:t xml:space="preserve">Presentations run continuously from 10:50 to 2:10</w:t>
-      </w:r>
-    </w:p>
-    <w:bookmarkEnd w:id="10"/>
-    <w:bookmarkStart w:id="11" w:name="format-details"/>
+        <w:rPr>
+          <w:b/>
+          <w:bCs/>
+        </w:rPr>
+        <w:t xml:space="preserve">Judges per room:</w:t>
+      </w:r>
+      <w:r>
+        <w:t xml:space="preserve"> </w:t>
+      </w:r>
+      <w:r>
+        <w:t xml:space="preserve">2 (panel of 4 split across the two tracks)</w:t>
+      </w:r>
+    </w:p>
+    <w:p>
+      <w:pPr>
+        <w:pStyle w:val="Compact"/>
+        <w:numPr>
+          <w:ilvl w:val="0"/>
+          <w:numId w:val="1001"/>
+        </w:numPr>
+      </w:pPr>
+      <w:r>
+        <w:rPr>
+          <w:b/>
+          <w:bCs/>
+        </w:rPr>
+        <w:t xml:space="preserve">Combined deliberation:</w:t>
+      </w:r>
+      <w:r>
+        <w:t xml:space="preserve"> </w:t>
+      </w:r>
+      <w:r>
+        <w:t xml:space="preserve">All four judges meet over lunch (12:40–1:30) to compare scores and select winners</w:t>
+      </w:r>
+    </w:p>
+    <w:bookmarkEnd w:id="13"/>
+    <w:bookmarkStart w:id="14" w:name="lunch-logistics"/>
     <w:p>
       <w:pPr>
         <w:pStyle w:val="Heading2"/>
       </w:pPr>
       <w:r>
-        <w:t xml:space="preserve">Format Details</w:t>
+        <w:t xml:space="preserve">Lunch &amp; Logistics</w:t>
       </w:r>
     </w:p>
     <w:p>
@@ -732,17 +1017,17 @@
         </w:numPr>
       </w:pPr>
       <w:r>
+        <w:t xml:space="preserve">Buffet-style lunch is set out in the foyer starting at</w:t>
+      </w:r>
+      <w:r>
+        <w:t xml:space="preserve"> </w:t>
+      </w:r>
+      <w:r>
         <w:rPr>
           <w:b/>
           <w:bCs/>
         </w:rPr>
-        <w:t xml:space="preserve">Presentation:</w:t>
-      </w:r>
-      <w:r>
-        <w:t xml:space="preserve"> </w:t>
-      </w:r>
-      <w:r>
-        <w:t xml:space="preserve">15 minutes, strict</w:t>
+        <w:t xml:space="preserve">12:40 PM</w:t>
       </w:r>
     </w:p>
     <w:p>
@@ -754,17 +1039,7 @@
         </w:numPr>
       </w:pPr>
       <w:r>
-        <w:rPr>
-          <w:b/>
-          <w:bCs/>
-        </w:rPr>
-        <w:t xml:space="preserve">Q&amp;A:</w:t>
-      </w:r>
-      <w:r>
-        <w:t xml:space="preserve"> </w:t>
-      </w:r>
-      <w:r>
-        <w:t xml:space="preserve">5 minutes</w:t>
+        <w:t xml:space="preserve">Judges convene during lunch for combined scoring and winner selection</w:t>
       </w:r>
     </w:p>
     <w:p>
@@ -776,71 +1051,17 @@
         </w:numPr>
       </w:pPr>
       <w:r>
-        <w:rPr>
-          <w:b/>
-          <w:bCs/>
-        </w:rPr>
-        <w:t xml:space="preserve">Transition:</w:t>
-      </w:r>
-      <w:r>
-        <w:t xml:space="preserve"> </w:t>
-      </w:r>
-      <w:r>
-        <w:t xml:space="preserve">Built into the 20-minute slot</w:t>
-      </w:r>
-    </w:p>
-    <w:p>
-      <w:pPr>
-        <w:pStyle w:val="Compact"/>
-        <w:numPr>
-          <w:ilvl w:val="0"/>
-          <w:numId w:val="1002"/>
-        </w:numPr>
-      </w:pPr>
-      <w:r>
-        <w:rPr>
-          <w:b/>
-          <w:bCs/>
-        </w:rPr>
-        <w:t xml:space="preserve">Judging panel:</w:t>
-      </w:r>
-      <w:r>
-        <w:t xml:space="preserve"> </w:t>
-      </w:r>
-      <w:r>
-        <w:t xml:space="preserve">Consultants from Bain, BCG, EY, McKinsey and other firms</w:t>
-      </w:r>
-    </w:p>
-    <w:p>
-      <w:pPr>
-        <w:pStyle w:val="Compact"/>
-        <w:numPr>
-          <w:ilvl w:val="0"/>
-          <w:numId w:val="1002"/>
-        </w:numPr>
-      </w:pPr>
-      <w:r>
-        <w:rPr>
-          <w:b/>
-          <w:bCs/>
-        </w:rPr>
-        <w:t xml:space="preserve">Room:</w:t>
-      </w:r>
-      <w:r>
-        <w:t xml:space="preserve"> </w:t>
-      </w:r>
-      <w:r>
-        <w:t xml:space="preserve">Isenberg Classroom 210</w:t>
-      </w:r>
-    </w:p>
-    <w:bookmarkEnd w:id="11"/>
-    <w:bookmarkStart w:id="12" w:name="venue-map"/>
+        <w:t xml:space="preserve">Teams, audience eat whenever convenient</w:t>
+      </w:r>
+    </w:p>
+    <w:bookmarkEnd w:id="14"/>
+    <w:bookmarkStart w:id="15" w:name="venue"/>
     <w:p>
       <w:pPr>
         <w:pStyle w:val="Heading2"/>
       </w:pPr>
       <w:r>
-        <w:t xml:space="preserve">Venue Map</w:t>
+        <w:t xml:space="preserve">Venue</w:t>
       </w:r>
     </w:p>
     <w:p>
@@ -900,7 +1121,7 @@
           <w:b/>
           <w:bCs/>
         </w:rPr>
-        <w:t xml:space="preserve">Case Competition:</w:t>
+        <w:t xml:space="preserve">Case Competition — Track A:</w:t>
       </w:r>
       <w:r>
         <w:t xml:space="preserve"> </w:t>
@@ -922,13 +1143,13 @@
           <w:b/>
           <w:bCs/>
         </w:rPr>
-        <w:t xml:space="preserve">Lunch:</w:t>
+        <w:t xml:space="preserve">Case Competition — Track B:</w:t>
       </w:r>
       <w:r>
         <w:t xml:space="preserve"> </w:t>
       </w:r>
       <w:r>
-        <w:t xml:space="preserve">Foyer (buffet, from 1:30 PM)</w:t>
+        <w:t xml:space="preserve">Isenberg Classroom 106</w:t>
       </w:r>
     </w:p>
     <w:p>
@@ -944,13 +1165,13 @@
           <w:b/>
           <w:bCs/>
         </w:rPr>
-        <w:t xml:space="preserve">Consulting Panel:</w:t>
+        <w:t xml:space="preserve">Lunch:</w:t>
       </w:r>
       <w:r>
         <w:t xml:space="preserve"> </w:t>
       </w:r>
       <w:r>
-        <w:t xml:space="preserve">Isenberg 108</w:t>
+        <w:t xml:space="preserve">Foyer (buffet, from 12:40 PM)</w:t>
       </w:r>
     </w:p>
     <w:p>
@@ -966,17 +1187,39 @@
           <w:b/>
           <w:bCs/>
         </w:rPr>
+        <w:t xml:space="preserve">Consulting Panel:</w:t>
+      </w:r>
+      <w:r>
+        <w:t xml:space="preserve"> </w:t>
+      </w:r>
+      <w:r>
+        <w:t xml:space="preserve">Isenberg 108 (2:30–3:25)</w:t>
+      </w:r>
+    </w:p>
+    <w:p>
+      <w:pPr>
+        <w:pStyle w:val="Compact"/>
+        <w:numPr>
+          <w:ilvl w:val="0"/>
+          <w:numId w:val="1003"/>
+        </w:numPr>
+      </w:pPr>
+      <w:r>
+        <w:rPr>
+          <w:b/>
+          <w:bCs/>
+        </w:rPr>
         <w:t xml:space="preserve">Closing Ceremony &amp; Awards:</w:t>
       </w:r>
       <w:r>
         <w:t xml:space="preserve"> </w:t>
       </w:r>
       <w:r>
-        <w:t xml:space="preserve">Isenberg 108</w:t>
-      </w:r>
-    </w:p>
-    <w:bookmarkEnd w:id="12"/>
-    <w:bookmarkStart w:id="13" w:name="contact"/>
+        <w:t xml:space="preserve">Isenberg 108 (3:30–4:00)</w:t>
+      </w:r>
+    </w:p>
+    <w:bookmarkEnd w:id="15"/>
+    <w:bookmarkStart w:id="16" w:name="contact"/>
     <w:p>
       <w:pPr>
         <w:pStyle w:val="Heading2"/>
@@ -990,7 +1233,7 @@
         <w:pStyle w:val="FirstParagraph"/>
       </w:pPr>
       <w:r>
-        <w:t xml:space="preserve">For questions on the day: Jennifer Merton, Associate Chair, Management Department — jfmerton@isenberg.umass.edu</w:t>
+        <w:t xml:space="preserve">For questions: Jennifer Merton, Associate Chair, Management Department — jfmerton@isenberg.umass.edu</w:t>
       </w:r>
     </w:p>
     <w:p>
@@ -1012,8 +1255,8 @@
         <w:t xml:space="preserve">Isenberg School of Management · University of Massachusetts Amherst</w:t>
       </w:r>
     </w:p>
-    <w:bookmarkEnd w:id="13"/>
-    <w:bookmarkEnd w:id="14"/>
+    <w:bookmarkEnd w:id="16"/>
+    <w:bookmarkEnd w:id="17"/>
     <w:sectPr>
       <w:footnotePr>
         <w:numRestart w:val="eachSect"/>

</xml_diff>

<commit_message>
Caterers arrive at 1:00; build in 30-min overrun buffer
</commit_message>
<xml_diff>
--- a/ICA_2026_CaseComp_Schedule.docx
+++ b/ICA_2026_CaseComp_Schedule.docx
@@ -995,7 +995,7 @@
         <w:t xml:space="preserve"> </w:t>
       </w:r>
       <w:r>
-        <w:t xml:space="preserve">All four judges meet over lunch (12:40–1:30) to compare scores and select winners</w:t>
+        <w:t xml:space="preserve">All four judges meet over lunch (1:00–2:00) to compare scores and select winners</w:t>
       </w:r>
     </w:p>
     <w:bookmarkEnd w:id="13"/>
@@ -1017,7 +1017,7 @@
         </w:numPr>
       </w:pPr>
       <w:r>
-        <w:t xml:space="preserve">Buffet-style lunch is set out in the foyer starting at</w:t>
+        <w:t xml:space="preserve">Caterers arrive at</w:t>
       </w:r>
       <w:r>
         <w:t xml:space="preserve"> </w:t>
@@ -1027,7 +1027,10 @@
           <w:b/>
           <w:bCs/>
         </w:rPr>
-        <w:t xml:space="preserve">12:40 PM</w:t>
+        <w:t xml:space="preserve">1:00 PM</w:t>
+      </w:r>
+      <w:r>
+        <w:t xml:space="preserve">; buffet set out in foyer at that time</w:t>
       </w:r>
     </w:p>
     <w:p>
@@ -1051,7 +1054,29 @@
         </w:numPr>
       </w:pPr>
       <w:r>
-        <w:t xml:space="preserve">Teams, audience eat whenever convenient</w:t>
+        <w:t xml:space="preserve">Teams and audience eat whenever convenient</w:t>
+      </w:r>
+    </w:p>
+    <w:p>
+      <w:pPr>
+        <w:pStyle w:val="Compact"/>
+        <w:numPr>
+          <w:ilvl w:val="0"/>
+          <w:numId w:val="1002"/>
+        </w:numPr>
+      </w:pPr>
+      <w:r>
+        <w:rPr>
+          <w:b/>
+          <w:bCs/>
+        </w:rPr>
+        <w:t xml:space="preserve">Note:</w:t>
+      </w:r>
+      <w:r>
+        <w:t xml:space="preserve"> </w:t>
+      </w:r>
+      <w:r>
+        <w:t xml:space="preserve">Room schedules show a 12:40 finish, but a 20–30 minute overrun is normal. The 1:00 lunch start absorbs this naturally — no need to rush teams</w:t>
       </w:r>
     </w:p>
     <w:bookmarkEnd w:id="14"/>
@@ -1171,7 +1196,7 @@
         <w:t xml:space="preserve"> </w:t>
       </w:r>
       <w:r>
-        <w:t xml:space="preserve">Foyer (buffet, from 12:40 PM)</w:t>
+        <w:t xml:space="preserve">Foyer (buffet, caterers arrive 1:00 PM)</w:t>
       </w:r>
     </w:p>
     <w:p>

</xml_diff>

<commit_message>
Add team assignments (8 teams: 1,2,3,4,5,7,8,9). Track A: 1,3,5,7. Track B: 2,4,8,9.
</commit_message>
<xml_diff>
--- a/ICA_2026_CaseComp_Schedule.docx
+++ b/ICA_2026_CaseComp_Schedule.docx
@@ -54,7 +54,7 @@
         <w:t xml:space="preserve"> </w:t>
       </w:r>
       <w:r>
-        <w:t xml:space="preserve">Isenberg 210 and Isenberg 106 · Judges split 2/2 across rooms</w:t>
+        <w:t xml:space="preserve">Isenberg 210 and Isenberg 106 · Judges split 2/2</w:t>
       </w:r>
     </w:p>
     <w:p>
@@ -64,13 +64,13 @@
         </w:pict>
       </w:r>
     </w:p>
-    <w:bookmarkStart w:id="9" w:name="joint-sessions"/>
+    <w:bookmarkStart w:id="9" w:name="joint-morning"/>
     <w:p>
       <w:pPr>
         <w:pStyle w:val="Heading2"/>
       </w:pPr>
       <w:r>
-        <w:t xml:space="preserve">Joint Sessions</w:t>
+        <w:t xml:space="preserve">Joint Morning</w:t>
       </w:r>
     </w:p>
     <w:tbl>
@@ -216,12 +216,14 @@
     <w:tbl>
       <w:tblPr>
         <w:tblStyle w:val="Table"/>
-        <w:tblW w:type="auto" w:w="0"/>
+        <w:tblW w:type="pct" w:w="5000"/>
+        <w:tblLayout w:type="fixed"/>
         <w:tblLook w:firstRow="1" w:lastRow="0" w:firstColumn="0" w:lastColumn="0" w:noHBand="0" w:noVBand="0" w:val="0020"/>
       </w:tblPr>
       <w:tblGrid>
-        <w:gridCol w:w="3960"/>
-        <w:gridCol w:w="3960"/>
+        <w:gridCol w:w="2262"/>
+        <w:gridCol w:w="2262"/>
+        <w:gridCol w:w="3394"/>
       </w:tblGrid>
       <w:tr>
         <w:trPr>
@@ -245,7 +247,18 @@
               <w:pStyle w:val="Compact"/>
             </w:pPr>
             <w:r>
-              <w:t xml:space="preserve">Event</w:t>
+              <w:t xml:space="preserve">Team</w:t>
+            </w:r>
+          </w:p>
+        </w:tc>
+        <w:tc>
+          <w:tcPr/>
+          <w:p>
+            <w:pPr>
+              <w:pStyle w:val="Compact"/>
+            </w:pPr>
+            <w:r>
+              <w:t xml:space="preserve">Members</w:t>
             </w:r>
           </w:p>
         </w:tc>
@@ -277,7 +290,18 @@
                 <w:b/>
                 <w:bCs/>
               </w:rPr>
-              <w:t xml:space="preserve">Team A1</w:t>
+              <w:t xml:space="preserve">Team 1</w:t>
+            </w:r>
+          </w:p>
+        </w:tc>
+        <w:tc>
+          <w:tcPr/>
+          <w:p>
+            <w:pPr>
+              <w:pStyle w:val="Compact"/>
+            </w:pPr>
+            <w:r>
+              <w:t xml:space="preserve">Andrew Tollman, Kyo Shibata</w:t>
             </w:r>
           </w:p>
         </w:tc>
@@ -309,7 +333,18 @@
                 <w:b/>
                 <w:bCs/>
               </w:rPr>
-              <w:t xml:space="preserve">Team A2</w:t>
+              <w:t xml:space="preserve">Team 3</w:t>
+            </w:r>
+          </w:p>
+        </w:tc>
+        <w:tc>
+          <w:tcPr/>
+          <w:p>
+            <w:pPr>
+              <w:pStyle w:val="Compact"/>
+            </w:pPr>
+            <w:r>
+              <w:t xml:space="preserve">Ella Glasgow, Sohil Darisipudi, Zoey Schuler</w:t>
             </w:r>
           </w:p>
         </w:tc>
@@ -341,7 +376,18 @@
                 <w:b/>
                 <w:bCs/>
               </w:rPr>
-              <w:t xml:space="preserve">Team A3</w:t>
+              <w:t xml:space="preserve">Team 5</w:t>
+            </w:r>
+          </w:p>
+        </w:tc>
+        <w:tc>
+          <w:tcPr/>
+          <w:p>
+            <w:pPr>
+              <w:pStyle w:val="Compact"/>
+            </w:pPr>
+            <w:r>
+              <w:t xml:space="preserve">Amalan Durairaj, Krish Patel, Varija Manglik, Astha Vaghasiya</w:t>
             </w:r>
           </w:p>
         </w:tc>
@@ -373,6 +419,17 @@
             </w:r>
           </w:p>
         </w:tc>
+        <w:tc>
+          <w:tcPr/>
+          <w:p>
+            <w:pPr>
+              <w:pStyle w:val="Compact"/>
+            </w:pPr>
+            <w:r>
+              <w:t xml:space="preserve">—</w:t>
+            </w:r>
+          </w:p>
+        </w:tc>
       </w:tr>
       <w:tr>
         <w:tc>
@@ -401,39 +458,18 @@
                 <w:b/>
                 <w:bCs/>
               </w:rPr>
-              <w:t xml:space="preserve">Team A4</w:t>
-            </w:r>
-          </w:p>
-        </w:tc>
-      </w:tr>
-      <w:tr>
-        <w:tc>
-          <w:tcPr/>
-          <w:p>
-            <w:pPr>
-              <w:pStyle w:val="Compact"/>
-            </w:pPr>
-            <w:r>
-              <w:rPr>
-                <w:b/>
-                <w:bCs/>
-              </w:rPr>
-              <w:t xml:space="preserve">12:20–12:40</w:t>
-            </w:r>
-          </w:p>
-        </w:tc>
-        <w:tc>
-          <w:tcPr/>
-          <w:p>
-            <w:pPr>
-              <w:pStyle w:val="Compact"/>
-            </w:pPr>
-            <w:r>
-              <w:rPr>
-                <w:b/>
-                <w:bCs/>
-              </w:rPr>
-              <w:t xml:space="preserve">Team A5</w:t>
+              <w:t xml:space="preserve">Team 7</w:t>
+            </w:r>
+          </w:p>
+        </w:tc>
+        <w:tc>
+          <w:tcPr/>
+          <w:p>
+            <w:pPr>
+              <w:pStyle w:val="Compact"/>
+            </w:pPr>
+            <w:r>
+              <w:t xml:space="preserve">Jaden Odorczuk, Tejas Naik</w:t>
             </w:r>
           </w:p>
         </w:tc>
@@ -452,12 +488,14 @@
     <w:tbl>
       <w:tblPr>
         <w:tblStyle w:val="Table"/>
-        <w:tblW w:type="auto" w:w="0"/>
+        <w:tblW w:type="pct" w:w="5000"/>
+        <w:tblLayout w:type="fixed"/>
         <w:tblLook w:firstRow="1" w:lastRow="0" w:firstColumn="0" w:lastColumn="0" w:noHBand="0" w:noVBand="0" w:val="0020"/>
       </w:tblPr>
       <w:tblGrid>
-        <w:gridCol w:w="3960"/>
-        <w:gridCol w:w="3960"/>
+        <w:gridCol w:w="2262"/>
+        <w:gridCol w:w="2262"/>
+        <w:gridCol w:w="3394"/>
       </w:tblGrid>
       <w:tr>
         <w:trPr>
@@ -481,7 +519,18 @@
               <w:pStyle w:val="Compact"/>
             </w:pPr>
             <w:r>
-              <w:t xml:space="preserve">Event</w:t>
+              <w:t xml:space="preserve">Team</w:t>
+            </w:r>
+          </w:p>
+        </w:tc>
+        <w:tc>
+          <w:tcPr/>
+          <w:p>
+            <w:pPr>
+              <w:pStyle w:val="Compact"/>
+            </w:pPr>
+            <w:r>
+              <w:t xml:space="preserve">Members</w:t>
             </w:r>
           </w:p>
         </w:tc>
@@ -513,7 +562,18 @@
                 <w:b/>
                 <w:bCs/>
               </w:rPr>
-              <w:t xml:space="preserve">Team B1</w:t>
+              <w:t xml:space="preserve">Team 2</w:t>
+            </w:r>
+          </w:p>
+        </w:tc>
+        <w:tc>
+          <w:tcPr/>
+          <w:p>
+            <w:pPr>
+              <w:pStyle w:val="Compact"/>
+            </w:pPr>
+            <w:r>
+              <w:t xml:space="preserve">Sanjitha Satish Prabu, Iris Cabral, Divya Sivaram, Shruthi Kotha</w:t>
             </w:r>
           </w:p>
         </w:tc>
@@ -545,7 +605,18 @@
                 <w:b/>
                 <w:bCs/>
               </w:rPr>
-              <w:t xml:space="preserve">Team B2</w:t>
+              <w:t xml:space="preserve">Team 4</w:t>
+            </w:r>
+          </w:p>
+        </w:tc>
+        <w:tc>
+          <w:tcPr/>
+          <w:p>
+            <w:pPr>
+              <w:pStyle w:val="Compact"/>
+            </w:pPr>
+            <w:r>
+              <w:t xml:space="preserve">Linh Vu, Huy Vu, Immar Sosa Sigaran</w:t>
             </w:r>
           </w:p>
         </w:tc>
@@ -577,7 +648,18 @@
                 <w:b/>
                 <w:bCs/>
               </w:rPr>
-              <w:t xml:space="preserve">Team B3</w:t>
+              <w:t xml:space="preserve">Team 8</w:t>
+            </w:r>
+          </w:p>
+        </w:tc>
+        <w:tc>
+          <w:tcPr/>
+          <w:p>
+            <w:pPr>
+              <w:pStyle w:val="Compact"/>
+            </w:pPr>
+            <w:r>
+              <w:t xml:space="preserve">Fariha Nuzhat, Vyshnavi Siddula, Sakshi Agarwal, Anvitha Sathu</w:t>
             </w:r>
           </w:p>
         </w:tc>
@@ -609,6 +691,17 @@
             </w:r>
           </w:p>
         </w:tc>
+        <w:tc>
+          <w:tcPr/>
+          <w:p>
+            <w:pPr>
+              <w:pStyle w:val="Compact"/>
+            </w:pPr>
+            <w:r>
+              <w:t xml:space="preserve">—</w:t>
+            </w:r>
+          </w:p>
+        </w:tc>
       </w:tr>
       <w:tr>
         <w:tc>
@@ -637,39 +730,18 @@
                 <w:b/>
                 <w:bCs/>
               </w:rPr>
-              <w:t xml:space="preserve">Team B4</w:t>
-            </w:r>
-          </w:p>
-        </w:tc>
-      </w:tr>
-      <w:tr>
-        <w:tc>
-          <w:tcPr/>
-          <w:p>
-            <w:pPr>
-              <w:pStyle w:val="Compact"/>
-            </w:pPr>
-            <w:r>
-              <w:rPr>
-                <w:b/>
-                <w:bCs/>
-              </w:rPr>
-              <w:t xml:space="preserve">12:20–12:40</w:t>
-            </w:r>
-          </w:p>
-        </w:tc>
-        <w:tc>
-          <w:tcPr/>
-          <w:p>
-            <w:pPr>
-              <w:pStyle w:val="Compact"/>
-            </w:pPr>
-            <w:r>
-              <w:rPr>
-                <w:b/>
-                <w:bCs/>
-              </w:rPr>
-              <w:t xml:space="preserve">Team B5</w:t>
+              <w:t xml:space="preserve">Team 9</w:t>
+            </w:r>
+          </w:p>
+        </w:tc>
+        <w:tc>
+          <w:tcPr/>
+          <w:p>
+            <w:pPr>
+              <w:pStyle w:val="Compact"/>
+            </w:pPr>
+            <w:r>
+              <w:t xml:space="preserve">Phil Patterson, Balaji Pranav Reddy Kaja, Chirag Khattar, Sreyoshi</w:t>
             </w:r>
           </w:p>
         </w:tc>
@@ -742,18 +814,18 @@
                 <w:b/>
                 <w:bCs/>
               </w:rPr>
-              <w:t xml:space="preserve">12:40–1:30</w:t>
-            </w:r>
-          </w:p>
-        </w:tc>
-        <w:tc>
-          <w:tcPr/>
-          <w:p>
-            <w:pPr>
-              <w:pStyle w:val="Compact"/>
-            </w:pPr>
-            <w:r>
-              <w:t xml:space="preserve">Judges’ lunch &amp; combined deliberation — Isenberg Atrium / foyer</w:t>
+              <w:t xml:space="preserve">~12:20–1:00</w:t>
+            </w:r>
+          </w:p>
+        </w:tc>
+        <w:tc>
+          <w:tcPr/>
+          <w:p>
+            <w:pPr>
+              <w:pStyle w:val="Compact"/>
+            </w:pPr>
+            <w:r>
+              <w:t xml:space="preserve">Buffer (room overruns expected; rooms wrap as teams finish)</w:t>
             </w:r>
           </w:p>
         </w:tc>
@@ -770,18 +842,46 @@
                 <w:b/>
                 <w:bCs/>
               </w:rPr>
-              <w:t xml:space="preserve">1:30–2:25</w:t>
-            </w:r>
-          </w:p>
-        </w:tc>
-        <w:tc>
-          <w:tcPr/>
-          <w:p>
-            <w:pPr>
-              <w:pStyle w:val="Compact"/>
-            </w:pPr>
-            <w:r>
-              <w:t xml:space="preserve">Open lunch (buffet in foyer; teams and audience eat)</w:t>
+              <w:t xml:space="preserve">1:00</w:t>
+            </w:r>
+          </w:p>
+        </w:tc>
+        <w:tc>
+          <w:tcPr/>
+          <w:p>
+            <w:pPr>
+              <w:pStyle w:val="Compact"/>
+            </w:pPr>
+            <w:r>
+              <w:t xml:space="preserve">Caterers arrive; buffet lunch set out in foyer</w:t>
+            </w:r>
+          </w:p>
+        </w:tc>
+      </w:tr>
+      <w:tr>
+        <w:tc>
+          <w:tcPr/>
+          <w:p>
+            <w:pPr>
+              <w:pStyle w:val="Compact"/>
+            </w:pPr>
+            <w:r>
+              <w:rPr>
+                <w:b/>
+                <w:bCs/>
+              </w:rPr>
+              <w:t xml:space="preserve">1:00–2:00</w:t>
+            </w:r>
+          </w:p>
+        </w:tc>
+        <w:tc>
+          <w:tcPr/>
+          <w:p>
+            <w:pPr>
+              <w:pStyle w:val="Compact"/>
+            </w:pPr>
+            <w:r>
+              <w:t xml:space="preserve">Lunch — judges convene for combined deliberation; teams and audience eat</w:t>
             </w:r>
           </w:p>
         </w:tc>
@@ -1076,7 +1176,7 @@
         <w:t xml:space="preserve"> </w:t>
       </w:r>
       <w:r>
-        <w:t xml:space="preserve">Room schedules show a 12:40 finish, but a 20–30 minute overrun is normal. The 1:00 lunch start absorbs this naturally — no need to rush teams</w:t>
+        <w:t xml:space="preserve">Room schedules show a 12:20 finish, but a 20–40 minute overrun is normal. The 1:00 lunch start absorbs this naturally — no need to rush teams</w:t>
       </w:r>
     </w:p>
     <w:bookmarkEnd w:id="14"/>

</xml_diff>